<commit_message>
feature: Aula 2 apologetica
</commit_message>
<xml_diff>
--- a/Theology/2026/segundo semestre/Apologetica/aula 1.docx
+++ b/Theology/2026/segundo semestre/Apologetica/aula 1.docx
@@ -4,11 +4,17 @@
   <w:body>
     <w:p>
       <w:pPr>
+        <w:ind w:left="720" w:hanging="360"/>
+      </w:pPr>
+    </w:p>
+    <w:p>
+      <w:pPr>
         <w:pStyle w:val="PargrafodaLista"/>
         <w:numPr>
           <w:ilvl w:val="0"/>
           <w:numId w:val="1"/>
         </w:numPr>
+        <w:jc w:val="both"/>
         <w:rPr>
           <w:lang w:val="pt-BR"/>
         </w:rPr>
@@ -33,6 +39,7 @@
           <w:ilvl w:val="0"/>
           <w:numId w:val="1"/>
         </w:numPr>
+        <w:jc w:val="both"/>
         <w:rPr>
           <w:lang w:val="pt-BR"/>
         </w:rPr>
@@ -81,6 +88,7 @@
           <w:ilvl w:val="0"/>
           <w:numId w:val="1"/>
         </w:numPr>
+        <w:jc w:val="both"/>
         <w:rPr>
           <w:lang w:val="pt-BR"/>
         </w:rPr>
@@ -117,6 +125,7 @@
           <w:ilvl w:val="1"/>
           <w:numId w:val="1"/>
         </w:numPr>
+        <w:jc w:val="both"/>
         <w:rPr>
           <w:lang w:val="pt-BR"/>
         </w:rPr>
@@ -141,6 +150,7 @@
           <w:ilvl w:val="1"/>
           <w:numId w:val="1"/>
         </w:numPr>
+        <w:jc w:val="both"/>
         <w:rPr>
           <w:lang w:val="pt-BR"/>
         </w:rPr>
@@ -165,6 +175,7 @@
           <w:ilvl w:val="1"/>
           <w:numId w:val="1"/>
         </w:numPr>
+        <w:jc w:val="both"/>
         <w:rPr>
           <w:lang w:val="pt-BR"/>
         </w:rPr>
@@ -189,6 +200,7 @@
           <w:ilvl w:val="1"/>
           <w:numId w:val="1"/>
         </w:numPr>
+        <w:jc w:val="both"/>
         <w:rPr>
           <w:lang w:val="pt-BR"/>
         </w:rPr>
@@ -207,6 +219,7 @@
           <w:ilvl w:val="0"/>
           <w:numId w:val="1"/>
         </w:numPr>
+        <w:jc w:val="both"/>
         <w:rPr>
           <w:lang w:val="pt-BR"/>
         </w:rPr>
@@ -255,6 +268,7 @@
           <w:ilvl w:val="1"/>
           <w:numId w:val="1"/>
         </w:numPr>
+        <w:jc w:val="both"/>
         <w:rPr>
           <w:lang w:val="pt-BR"/>
         </w:rPr>
@@ -269,16 +283,818 @@
         <w:rPr>
           <w:lang w:val="pt-BR"/>
         </w:rPr>
-        <w:t>o porque o cristianismo e verdade.</w:t>
+        <w:t xml:space="preserve">o </w:t>
+      </w:r>
+      <w:r>
+        <w:rPr>
+          <w:lang w:val="pt-BR"/>
+        </w:rPr>
+        <w:t>porquê</w:t>
+      </w:r>
+      <w:r>
+        <w:rPr>
+          <w:lang w:val="pt-BR"/>
+        </w:rPr>
+        <w:t xml:space="preserve"> o cristianismo e verdade.</w:t>
+      </w:r>
+    </w:p>
+    <w:p>
+      <w:pPr>
+        <w:pStyle w:val="PargrafodaLista"/>
+        <w:numPr>
+          <w:ilvl w:val="0"/>
+          <w:numId w:val="1"/>
+        </w:numPr>
+        <w:jc w:val="both"/>
+        <w:rPr>
+          <w:lang w:val="pt-BR"/>
+        </w:rPr>
+      </w:pPr>
+      <w:r>
+        <w:rPr>
+          <w:lang w:val="pt-BR"/>
+        </w:rPr>
+        <w:t>Questões</w:t>
+      </w:r>
+      <w:r>
+        <w:rPr>
+          <w:lang w:val="pt-BR"/>
+        </w:rPr>
+        <w:t xml:space="preserve"> que todo </w:t>
+      </w:r>
+      <w:r>
+        <w:rPr>
+          <w:lang w:val="pt-BR"/>
+        </w:rPr>
+        <w:t xml:space="preserve">Cristão tem que estar </w:t>
+      </w:r>
+      <w:r>
+        <w:rPr>
+          <w:lang w:val="pt-BR"/>
+        </w:rPr>
+        <w:t>preparo</w:t>
+      </w:r>
+      <w:r>
+        <w:rPr>
+          <w:lang w:val="pt-BR"/>
+        </w:rPr>
+        <w:t xml:space="preserve"> para responder.</w:t>
+      </w:r>
+    </w:p>
+    <w:p>
+      <w:pPr>
+        <w:pStyle w:val="PargrafodaLista"/>
+        <w:numPr>
+          <w:ilvl w:val="1"/>
+          <w:numId w:val="1"/>
+        </w:numPr>
+        <w:jc w:val="both"/>
+        <w:rPr>
+          <w:lang w:val="pt-BR"/>
+        </w:rPr>
+      </w:pPr>
+      <w:r>
+        <w:rPr>
+          <w:lang w:val="pt-BR"/>
+        </w:rPr>
+        <w:t>Os documentos do N.T foram corrompidos!</w:t>
+      </w:r>
+    </w:p>
+    <w:p>
+      <w:pPr>
+        <w:pStyle w:val="PargrafodaLista"/>
+        <w:numPr>
+          <w:ilvl w:val="2"/>
+          <w:numId w:val="1"/>
+        </w:numPr>
+        <w:jc w:val="both"/>
+        <w:rPr>
+          <w:highlight w:val="yellow"/>
+          <w:lang w:val="pt-BR"/>
+        </w:rPr>
+      </w:pPr>
+      <w:r>
+        <w:rPr>
+          <w:highlight w:val="yellow"/>
+          <w:lang w:val="pt-BR"/>
+        </w:rPr>
+        <w:t xml:space="preserve">Quem estuda os </w:t>
+      </w:r>
+      <w:r>
+        <w:rPr>
+          <w:highlight w:val="yellow"/>
+          <w:lang w:val="pt-BR"/>
+        </w:rPr>
+        <w:t>manuscritos</w:t>
+      </w:r>
+      <w:r>
+        <w:rPr>
+          <w:highlight w:val="yellow"/>
+          <w:lang w:val="pt-BR"/>
+        </w:rPr>
+        <w:t xml:space="preserve"> do novo</w:t>
+      </w:r>
+      <w:r>
+        <w:rPr>
+          <w:highlight w:val="yellow"/>
+          <w:lang w:val="pt-BR"/>
+        </w:rPr>
+        <w:t xml:space="preserve"> testamento e a Crítica Texto.</w:t>
+      </w:r>
+    </w:p>
+    <w:p>
+      <w:pPr>
+        <w:pStyle w:val="PargrafodaLista"/>
+        <w:numPr>
+          <w:ilvl w:val="1"/>
+          <w:numId w:val="1"/>
+        </w:numPr>
+        <w:jc w:val="both"/>
+        <w:rPr>
+          <w:highlight w:val="yellow"/>
+          <w:lang w:val="pt-BR"/>
+        </w:rPr>
+      </w:pPr>
+      <w:r>
+        <w:rPr>
+          <w:highlight w:val="yellow"/>
+          <w:lang w:val="pt-BR"/>
+        </w:rPr>
+        <w:t xml:space="preserve">Entao a </w:t>
+      </w:r>
+      <w:r>
+        <w:rPr>
+          <w:highlight w:val="yellow"/>
+          <w:lang w:val="pt-BR"/>
+        </w:rPr>
+        <w:t>crítica</w:t>
+      </w:r>
+      <w:r>
+        <w:rPr>
+          <w:highlight w:val="yellow"/>
+          <w:lang w:val="pt-BR"/>
+        </w:rPr>
+        <w:t xml:space="preserve"> textual possuindo </w:t>
+      </w:r>
+      <w:r>
+        <w:rPr>
+          <w:highlight w:val="yellow"/>
+          <w:lang w:val="pt-BR"/>
+        </w:rPr>
+        <w:t>estes manuscritos</w:t>
+      </w:r>
+      <w:r>
+        <w:rPr>
+          <w:highlight w:val="yellow"/>
+          <w:lang w:val="pt-BR"/>
+        </w:rPr>
+        <w:t xml:space="preserve"> parte agora para </w:t>
+      </w:r>
+      <w:r>
+        <w:rPr>
+          <w:highlight w:val="yellow"/>
+          <w:lang w:val="pt-BR"/>
+        </w:rPr>
+        <w:t>dois focos.</w:t>
+      </w:r>
+    </w:p>
+    <w:p>
+      <w:pPr>
+        <w:pStyle w:val="PargrafodaLista"/>
+        <w:numPr>
+          <w:ilvl w:val="2"/>
+          <w:numId w:val="1"/>
+        </w:numPr>
+        <w:jc w:val="both"/>
+        <w:rPr>
+          <w:highlight w:val="yellow"/>
+          <w:lang w:val="pt-BR"/>
+        </w:rPr>
+      </w:pPr>
+      <w:r>
+        <w:rPr>
+          <w:highlight w:val="yellow"/>
+          <w:lang w:val="pt-BR"/>
+        </w:rPr>
+        <w:t>Quantidade de manuscritos.</w:t>
+      </w:r>
+    </w:p>
+    <w:p>
+      <w:pPr>
+        <w:pStyle w:val="PargrafodaLista"/>
+        <w:numPr>
+          <w:ilvl w:val="2"/>
+          <w:numId w:val="1"/>
+        </w:numPr>
+        <w:jc w:val="both"/>
+        <w:rPr>
+          <w:highlight w:val="yellow"/>
+          <w:lang w:val="pt-BR"/>
+        </w:rPr>
+      </w:pPr>
+      <w:r>
+        <w:rPr>
+          <w:highlight w:val="yellow"/>
+          <w:lang w:val="pt-BR"/>
+        </w:rPr>
+        <w:t>Datação</w:t>
+      </w:r>
+      <w:r>
+        <w:rPr>
+          <w:highlight w:val="yellow"/>
+          <w:lang w:val="pt-BR"/>
+        </w:rPr>
+        <w:t xml:space="preserve"> dos manuscritos.</w:t>
+      </w:r>
+    </w:p>
+    <w:p>
+      <w:pPr>
+        <w:pStyle w:val="PargrafodaLista"/>
+        <w:numPr>
+          <w:ilvl w:val="2"/>
+          <w:numId w:val="1"/>
+        </w:numPr>
+        <w:jc w:val="both"/>
+        <w:rPr>
+          <w:highlight w:val="yellow"/>
+          <w:lang w:val="pt-BR"/>
+        </w:rPr>
+      </w:pPr>
+      <w:r>
+        <w:rPr>
+          <w:highlight w:val="yellow"/>
+          <w:lang w:val="pt-BR"/>
+        </w:rPr>
+        <w:t xml:space="preserve">No Grego são mais de </w:t>
+      </w:r>
+      <w:r>
+        <w:rPr>
+          <w:highlight w:val="yellow"/>
+          <w:lang w:val="pt-BR"/>
+        </w:rPr>
+        <w:t>5.000 cinco mil, em outras línguas 19</w:t>
+      </w:r>
+      <w:r>
+        <w:rPr>
+          <w:highlight w:val="yellow"/>
+          <w:lang w:val="pt-BR"/>
+        </w:rPr>
+        <w:t>.000</w:t>
+      </w:r>
+      <w:r>
+        <w:rPr>
+          <w:highlight w:val="yellow"/>
+          <w:lang w:val="pt-BR"/>
+        </w:rPr>
+        <w:t>.</w:t>
+      </w:r>
+    </w:p>
+    <w:p>
+      <w:pPr>
+        <w:pStyle w:val="PargrafodaLista"/>
+        <w:numPr>
+          <w:ilvl w:val="3"/>
+          <w:numId w:val="1"/>
+        </w:numPr>
+        <w:jc w:val="both"/>
+        <w:rPr>
+          <w:highlight w:val="yellow"/>
+          <w:lang w:val="pt-BR"/>
+        </w:rPr>
+      </w:pPr>
+      <w:r>
+        <w:rPr>
+          <w:highlight w:val="yellow"/>
+          <w:lang w:val="pt-BR"/>
+        </w:rPr>
+        <w:t>10000 Latim</w:t>
+      </w:r>
+    </w:p>
+    <w:p>
+      <w:pPr>
+        <w:pStyle w:val="PargrafodaLista"/>
+        <w:numPr>
+          <w:ilvl w:val="3"/>
+          <w:numId w:val="1"/>
+        </w:numPr>
+        <w:jc w:val="both"/>
+        <w:rPr>
+          <w:highlight w:val="yellow"/>
+          <w:lang w:val="pt-BR"/>
+        </w:rPr>
+      </w:pPr>
+      <w:r>
+        <w:rPr>
+          <w:highlight w:val="yellow"/>
+          <w:lang w:val="pt-BR"/>
+        </w:rPr>
+        <w:t>9000 Copit</w:t>
+      </w:r>
+      <w:r>
+        <w:rPr>
+          <w:highlight w:val="yellow"/>
+          <w:lang w:val="pt-BR"/>
+        </w:rPr>
+        <w:t>a</w:t>
+      </w:r>
+      <w:r>
+        <w:rPr>
+          <w:highlight w:val="yellow"/>
+          <w:lang w:val="pt-BR"/>
+        </w:rPr>
+        <w:t xml:space="preserve">s, </w:t>
+      </w:r>
+      <w:r>
+        <w:rPr>
+          <w:highlight w:val="yellow"/>
+          <w:lang w:val="pt-BR"/>
+        </w:rPr>
+        <w:t>Árabes</w:t>
+      </w:r>
+      <w:r>
+        <w:rPr>
+          <w:highlight w:val="yellow"/>
+          <w:lang w:val="pt-BR"/>
+        </w:rPr>
+        <w:t xml:space="preserve">, </w:t>
+      </w:r>
+      <w:r>
+        <w:rPr>
+          <w:highlight w:val="yellow"/>
+          <w:lang w:val="pt-BR"/>
+        </w:rPr>
+        <w:t>Sírios, Slavos</w:t>
+      </w:r>
+    </w:p>
+    <w:p>
+      <w:pPr>
+        <w:pStyle w:val="PargrafodaLista"/>
+        <w:numPr>
+          <w:ilvl w:val="0"/>
+          <w:numId w:val="1"/>
+        </w:numPr>
+        <w:jc w:val="both"/>
+        <w:rPr>
+          <w:lang w:val="pt-BR"/>
+        </w:rPr>
+      </w:pPr>
+      <w:r>
+        <w:rPr>
+          <w:lang w:val="pt-BR"/>
+        </w:rPr>
+        <w:t xml:space="preserve">O Documento </w:t>
+      </w:r>
+      <w:commentRangeStart w:id="0"/>
+      <w:r>
+        <w:rPr>
+          <w:lang w:val="pt-BR"/>
+        </w:rPr>
+        <w:t>B 52</w:t>
+      </w:r>
+      <w:commentRangeEnd w:id="0"/>
+      <w:r>
+        <w:rPr>
+          <w:rStyle w:val="Refdecomentrio"/>
+          <w:sz w:val="24"/>
+          <w:szCs w:val="24"/>
+          <w:lang w:val="pt-BR"/>
+        </w:rPr>
+        <w:commentReference w:id="0"/>
+      </w:r>
+      <w:r>
+        <w:rPr>
+          <w:lang w:val="pt-BR"/>
+        </w:rPr>
+        <w:t xml:space="preserve"> </w:t>
+      </w:r>
+      <w:r>
+        <w:rPr>
+          <w:lang w:val="pt-BR"/>
+        </w:rPr>
+        <w:t>ele contém</w:t>
+      </w:r>
+      <w:r>
+        <w:rPr>
+          <w:lang w:val="pt-BR"/>
+        </w:rPr>
+        <w:t xml:space="preserve"> partes do evangelho de JO Cap 1</w:t>
+      </w:r>
+      <w:r>
+        <w:rPr>
+          <w:lang w:val="pt-BR"/>
+        </w:rPr>
+        <w:t>8</w:t>
+      </w:r>
+    </w:p>
+    <w:p>
+      <w:pPr>
+        <w:pStyle w:val="PargrafodaLista"/>
+        <w:numPr>
+          <w:ilvl w:val="1"/>
+          <w:numId w:val="1"/>
+        </w:numPr>
+        <w:jc w:val="both"/>
+        <w:rPr>
+          <w:lang w:val="pt-BR"/>
+        </w:rPr>
+      </w:pPr>
+      <w:r>
+        <w:rPr>
+          <w:lang w:val="pt-BR"/>
+        </w:rPr>
+        <w:t>Data de 117 a 125.</w:t>
+      </w:r>
+    </w:p>
+    <w:p>
+      <w:pPr>
+        <w:pStyle w:val="PargrafodaLista"/>
+        <w:ind w:left="1440"/>
+        <w:jc w:val="both"/>
+        <w:rPr>
+          <w:lang w:val="pt-BR"/>
+        </w:rPr>
+      </w:pPr>
+    </w:p>
+    <w:p>
+      <w:pPr>
+        <w:jc w:val="both"/>
+        <w:rPr>
+          <w:lang w:val="pt-BR"/>
+        </w:rPr>
+      </w:pPr>
+      <w:r>
+        <w:rPr>
+          <w:lang w:val="pt-BR"/>
+        </w:rPr>
+        <w:t>2)</w:t>
+      </w:r>
+      <w:r>
+        <w:rPr>
+          <w:lang w:val="pt-BR"/>
+        </w:rPr>
+        <w:t xml:space="preserve"> A Ressureição de Jesus Cristo e um </w:t>
+      </w:r>
+      <w:r>
+        <w:rPr>
+          <w:lang w:val="pt-BR"/>
+        </w:rPr>
+        <w:t>fato?</w:t>
+      </w:r>
+    </w:p>
+    <w:p>
+      <w:pPr>
+        <w:jc w:val="both"/>
+        <w:rPr>
+          <w:lang w:val="pt-BR"/>
+        </w:rPr>
+      </w:pPr>
+    </w:p>
+    <w:p>
+      <w:pPr>
+        <w:pStyle w:val="PargrafodaLista"/>
+        <w:numPr>
+          <w:ilvl w:val="0"/>
+          <w:numId w:val="1"/>
+        </w:numPr>
+        <w:jc w:val="both"/>
+        <w:rPr>
+          <w:lang w:val="pt-BR"/>
+        </w:rPr>
+      </w:pPr>
+      <w:r>
+        <w:rPr>
+          <w:lang w:val="pt-BR"/>
+        </w:rPr>
+        <w:t xml:space="preserve">Para responder a esta questão temos que recorrer a filosofia que fundamenta a tese de que </w:t>
+      </w:r>
+      <w:r>
+        <w:rPr>
+          <w:lang w:val="pt-BR"/>
+        </w:rPr>
+        <w:t>o corpo físico e a prisão da alma.</w:t>
+      </w:r>
+      <w:r>
+        <w:rPr>
+          <w:lang w:val="pt-BR"/>
+        </w:rPr>
+        <w:t xml:space="preserve"> Daquela forma segundo a cultura vigente não faria sentido alguém ressuscitar em um corpo</w:t>
+      </w:r>
+      <w:r>
+        <w:rPr>
+          <w:lang w:val="pt-BR"/>
+        </w:rPr>
+        <w:t xml:space="preserve"> físico.</w:t>
+      </w:r>
+      <w:r>
+        <w:rPr>
+          <w:lang w:val="pt-BR"/>
+        </w:rPr>
+        <w:t xml:space="preserve"> Já os Judeus criam na </w:t>
+      </w:r>
+      <w:r>
+        <w:rPr>
+          <w:lang w:val="pt-BR"/>
+        </w:rPr>
+        <w:t>ressurreição</w:t>
+      </w:r>
+      <w:r>
+        <w:rPr>
+          <w:lang w:val="pt-BR"/>
+        </w:rPr>
+        <w:t xml:space="preserve"> </w:t>
+      </w:r>
+      <w:r>
+        <w:rPr>
+          <w:lang w:val="pt-BR"/>
+        </w:rPr>
+        <w:t>somente no final dos tempos</w:t>
+      </w:r>
+      <w:r>
+        <w:rPr>
+          <w:lang w:val="pt-BR"/>
+        </w:rPr>
+        <w:t>.</w:t>
+      </w:r>
+    </w:p>
+    <w:p>
+      <w:pPr>
+        <w:pStyle w:val="PargrafodaLista"/>
+        <w:numPr>
+          <w:ilvl w:val="0"/>
+          <w:numId w:val="1"/>
+        </w:numPr>
+        <w:jc w:val="both"/>
+        <w:rPr>
+          <w:highlight w:val="yellow"/>
+          <w:lang w:val="pt-BR"/>
+        </w:rPr>
+      </w:pPr>
+      <w:r>
+        <w:rPr>
+          <w:highlight w:val="yellow"/>
+          <w:lang w:val="pt-BR"/>
+        </w:rPr>
+        <w:t>Fatos</w:t>
+      </w:r>
+    </w:p>
+    <w:p>
+      <w:pPr>
+        <w:pStyle w:val="PargrafodaLista"/>
+        <w:numPr>
+          <w:ilvl w:val="1"/>
+          <w:numId w:val="1"/>
+        </w:numPr>
+        <w:jc w:val="both"/>
+        <w:rPr>
+          <w:highlight w:val="yellow"/>
+          <w:lang w:val="pt-BR"/>
+        </w:rPr>
+      </w:pPr>
+      <w:r>
+        <w:rPr>
+          <w:highlight w:val="yellow"/>
+          <w:lang w:val="pt-BR"/>
+        </w:rPr>
+        <w:t>A morte de Jesus na Cruz.</w:t>
+      </w:r>
+    </w:p>
+    <w:p>
+      <w:pPr>
+        <w:pStyle w:val="PargrafodaLista"/>
+        <w:numPr>
+          <w:ilvl w:val="1"/>
+          <w:numId w:val="1"/>
+        </w:numPr>
+        <w:jc w:val="both"/>
+        <w:rPr>
+          <w:highlight w:val="yellow"/>
+          <w:lang w:val="pt-BR"/>
+        </w:rPr>
+      </w:pPr>
+      <w:r>
+        <w:rPr>
+          <w:highlight w:val="yellow"/>
+          <w:lang w:val="pt-BR"/>
+        </w:rPr>
+        <w:t xml:space="preserve">Os discípulos testemunharam a sua </w:t>
+      </w:r>
+      <w:r>
+        <w:rPr>
+          <w:highlight w:val="yellow"/>
+          <w:lang w:val="pt-BR"/>
+        </w:rPr>
+        <w:t>ressurreição.</w:t>
+      </w:r>
+    </w:p>
+    <w:p>
+      <w:pPr>
+        <w:pStyle w:val="PargrafodaLista"/>
+        <w:numPr>
+          <w:ilvl w:val="1"/>
+          <w:numId w:val="1"/>
+        </w:numPr>
+        <w:jc w:val="both"/>
+        <w:rPr>
+          <w:highlight w:val="yellow"/>
+          <w:lang w:val="pt-BR"/>
+        </w:rPr>
+      </w:pPr>
+      <w:r>
+        <w:rPr>
+          <w:highlight w:val="yellow"/>
+          <w:lang w:val="pt-BR"/>
+        </w:rPr>
+        <w:t>A conversão do perseguidor – Paulo.</w:t>
+      </w:r>
+    </w:p>
+    <w:p>
+      <w:pPr>
+        <w:pStyle w:val="PargrafodaLista"/>
+        <w:numPr>
+          <w:ilvl w:val="1"/>
+          <w:numId w:val="1"/>
+        </w:numPr>
+        <w:jc w:val="both"/>
+        <w:rPr>
+          <w:highlight w:val="yellow"/>
+          <w:lang w:val="pt-BR"/>
+        </w:rPr>
+      </w:pPr>
+      <w:r>
+        <w:rPr>
+          <w:highlight w:val="yellow"/>
+          <w:lang w:val="pt-BR"/>
+        </w:rPr>
+        <w:t>Thiago irmão de Jesus se converteu e se tornou líder da igreja de Jerusalém.</w:t>
+      </w:r>
+    </w:p>
+    <w:p>
+      <w:pPr>
+        <w:pStyle w:val="PargrafodaLista"/>
+        <w:numPr>
+          <w:ilvl w:val="0"/>
+          <w:numId w:val="1"/>
+        </w:numPr>
+        <w:jc w:val="both"/>
+        <w:rPr>
+          <w:lang w:val="pt-BR"/>
+        </w:rPr>
+      </w:pPr>
+      <w:r>
+        <w:rPr>
+          <w:lang w:val="pt-BR"/>
+        </w:rPr>
+        <w:lastRenderedPageBreak/>
+        <w:t>O Tumulo Vazio</w:t>
+      </w:r>
+    </w:p>
+    <w:p>
+      <w:pPr>
+        <w:jc w:val="both"/>
+        <w:rPr>
+          <w:lang w:val="pt-BR"/>
+        </w:rPr>
+      </w:pPr>
+    </w:p>
+    <w:p>
+      <w:pPr>
+        <w:jc w:val="both"/>
+        <w:rPr>
+          <w:lang w:val="pt-BR"/>
+        </w:rPr>
+      </w:pPr>
+      <w:r>
+        <w:rPr>
+          <w:lang w:val="pt-BR"/>
+        </w:rPr>
+        <w:t xml:space="preserve">3) O Que diz a </w:t>
+      </w:r>
+      <w:r>
+        <w:rPr>
+          <w:lang w:val="pt-BR"/>
+        </w:rPr>
+        <w:t>Ciência</w:t>
+      </w:r>
+      <w:r>
+        <w:rPr>
+          <w:lang w:val="pt-BR"/>
+        </w:rPr>
+        <w:t>.</w:t>
+      </w:r>
+    </w:p>
+    <w:p>
+      <w:pPr>
+        <w:jc w:val="both"/>
+        <w:rPr>
+          <w:lang w:val="pt-BR"/>
+        </w:rPr>
+      </w:pPr>
+    </w:p>
+    <w:p>
+      <w:pPr>
+        <w:pStyle w:val="PargrafodaLista"/>
+        <w:numPr>
+          <w:ilvl w:val="0"/>
+          <w:numId w:val="1"/>
+        </w:numPr>
+        <w:jc w:val="both"/>
+        <w:rPr>
+          <w:lang w:val="pt-BR"/>
+        </w:rPr>
+      </w:pPr>
+      <w:r>
+        <w:rPr>
+          <w:lang w:val="pt-BR"/>
+        </w:rPr>
+        <w:t xml:space="preserve"> A ciência se importa em estudar o mundo material, </w:t>
+      </w:r>
+      <w:r>
+        <w:rPr>
+          <w:lang w:val="pt-BR"/>
+        </w:rPr>
+        <w:t xml:space="preserve">físico. Sendo Deus imaterial </w:t>
+      </w:r>
+      <w:r>
+        <w:rPr>
+          <w:lang w:val="pt-BR"/>
+        </w:rPr>
+        <w:t>e impossível fazer um estudo aprofundado sobre o próprio Deus</w:t>
+      </w:r>
+      <w:r>
+        <w:rPr>
+          <w:lang w:val="pt-BR"/>
+        </w:rPr>
+        <w:t xml:space="preserve">. A ciência pode estudar as causas e efeitos da </w:t>
+      </w:r>
+      <w:r>
+        <w:rPr>
+          <w:lang w:val="pt-BR"/>
+        </w:rPr>
+        <w:t xml:space="preserve">criação, aqui já falamos de </w:t>
+      </w:r>
+      <w:r>
+        <w:rPr>
+          <w:lang w:val="pt-BR"/>
+        </w:rPr>
+        <w:t>Metafísica</w:t>
+      </w:r>
+      <w:r>
+        <w:rPr>
+          <w:lang w:val="pt-BR"/>
+        </w:rPr>
+        <w:t xml:space="preserve"> ramo da filosofia que estuda a natureza fundamental </w:t>
+      </w:r>
+      <w:r>
+        <w:rPr>
+          <w:lang w:val="pt-BR"/>
+        </w:rPr>
+        <w:t>da realidade. A existência do ser</w:t>
+      </w:r>
+      <w:r>
+        <w:rPr>
+          <w:lang w:val="pt-BR"/>
+        </w:rPr>
+        <w:t>, sendo D</w:t>
+      </w:r>
+      <w:r>
+        <w:rPr>
+          <w:lang w:val="pt-BR"/>
+        </w:rPr>
+        <w:t>eus a causa primaria de toda a existência e a ciência que se ocupa das causas secundarias</w:t>
+      </w:r>
+      <w:r>
+        <w:rPr>
+          <w:lang w:val="pt-BR"/>
+        </w:rPr>
+        <w:t>, estudar a causa primaria foge ao escopo da chamada ciência.</w:t>
+      </w:r>
+    </w:p>
+    <w:p>
+      <w:pPr>
+        <w:pStyle w:val="PargrafodaLista"/>
+        <w:numPr>
+          <w:ilvl w:val="0"/>
+          <w:numId w:val="1"/>
+        </w:numPr>
+        <w:jc w:val="both"/>
+        <w:rPr>
+          <w:lang w:val="pt-BR"/>
+        </w:rPr>
+      </w:pPr>
+      <w:r>
+        <w:rPr>
+          <w:lang w:val="pt-BR"/>
+        </w:rPr>
+        <w:t>[1 TM 20.21] Estudar filosofia e a falsa ciência.</w:t>
       </w:r>
     </w:p>
     <w:sectPr>
-      <w:headerReference w:type="even" r:id="rId7"/>
-      <w:headerReference w:type="default" r:id="rId8"/>
-      <w:footerReference w:type="even" r:id="rId9"/>
-      <w:footerReference w:type="default" r:id="rId10"/>
-      <w:headerReference w:type="first" r:id="rId11"/>
-      <w:footerReference w:type="first" r:id="rId12"/>
+      <w:headerReference w:type="even" r:id="rId11"/>
+      <w:headerReference w:type="default" r:id="rId12"/>
+      <w:footerReference w:type="even" r:id="rId13"/>
+      <w:footerReference w:type="default" r:id="rId14"/>
+      <w:headerReference w:type="first" r:id="rId15"/>
+      <w:footerReference w:type="first" r:id="rId16"/>
       <w:pgSz w:w="12240" w:h="15840"/>
       <w:pgMar w:top="1440" w:right="1440" w:bottom="1440" w:left="1440" w:header="720" w:footer="720" w:gutter="0"/>
       <w:cols w:space="720"/>
@@ -286,6 +1102,45 @@
     </w:sectPr>
   </w:body>
 </w:document>
+</file>
+
+<file path=word/comments.xml><?xml version="1.0" encoding="utf-8"?>
+<w:comments xmlns:wpc="http://schemas.microsoft.com/office/word/2010/wordprocessingCanvas" xmlns:cx="http://schemas.microsoft.com/office/drawing/2014/chartex" xmlns:cx1="http://schemas.microsoft.com/office/drawing/2015/9/8/chartex" xmlns:cx2="http://schemas.microsoft.com/office/drawing/2015/10/21/chartex" xmlns:cx3="http://schemas.microsoft.com/office/drawing/2016/5/9/chartex" xmlns:cx4="http://schemas.microsoft.com/office/drawing/2016/5/10/chartex" xmlns:cx5="http://schemas.microsoft.com/office/drawing/2016/5/11/chartex" xmlns:cx6="http://schemas.microsoft.com/office/drawing/2016/5/12/chartex" xmlns:cx7="http://schemas.microsoft.com/office/drawing/2016/5/13/chartex" xmlns:cx8="http://schemas.microsoft.com/office/drawing/2016/5/14/chartex" xmlns:mc="http://schemas.openxmlformats.org/markup-compatibility/2006" xmlns:aink="http://schemas.microsoft.com/office/drawing/2016/ink" xmlns:am3d="http://schemas.microsoft.com/office/drawing/2017/model3d" xmlns:o="urn:schemas-microsoft-com:office:office" xmlns:oel="http://schemas.microsoft.com/office/2019/extlst" xmlns:r="http://schemas.openxmlformats.org/officeDocument/2006/relationships" xmlns:m="http://schemas.openxmlformats.org/officeDocument/2006/math" xmlns:v="urn:schemas-microsoft-com:vml" xmlns:wp14="http://schemas.microsoft.com/office/word/2010/wordprocessingDrawing" xmlns:wp="http://schemas.openxmlformats.org/drawingml/2006/wordprocessingDrawing" xmlns:w10="urn:schemas-microsoft-com:office:word" xmlns:w="http://schemas.openxmlformats.org/wordprocessingml/2006/main" xmlns:w14="http://schemas.microsoft.com/office/word/2010/wordml" xmlns:w15="http://schemas.microsoft.com/office/word/2012/wordml" xmlns:w16cex="http://schemas.microsoft.com/office/word/2018/wordml/cex" xmlns:w16cid="http://schemas.microsoft.com/office/word/2016/wordml/cid" xmlns:w16="http://schemas.microsoft.com/office/word/2018/wordml" xmlns:w16du="http://schemas.microsoft.com/office/word/2023/wordml/word16du" xmlns:w16sdtdh="http://schemas.microsoft.com/office/word/2020/wordml/sdtdatahash" xmlns:w16sdtfl="http://schemas.microsoft.com/office/word/2024/wordml/sdtformatlock" xmlns:w16se="http://schemas.microsoft.com/office/word/2015/wordml/symex" xmlns:wpg="http://schemas.microsoft.com/office/word/2010/wordprocessingGroup" xmlns:wpi="http://schemas.microsoft.com/office/word/2010/wordprocessingInk" xmlns:wne="http://schemas.microsoft.com/office/word/2006/wordml" xmlns:wps="http://schemas.microsoft.com/office/word/2010/wordprocessingShape" mc:Ignorable="w14 w15 w16se w16cid w16 w16cex w16sdtdh w16sdtfl w16du wp14">
+  <w:comment w:id="0" w:author="Alessandro dos Santos" w:date="2026-09-30T21:33:00Z" w:initials="Ad">
+    <w:p>
+      <w:pPr>
+        <w:pStyle w:val="Textodecomentrio"/>
+      </w:pPr>
+      <w:r>
+        <w:rPr>
+          <w:rStyle w:val="Refdecomentrio"/>
+        </w:rPr>
+        <w:annotationRef/>
+      </w:r>
+      <w:r>
+        <w:t>O Manuscrito que foi enviado no material da primeira aula</w:t>
+      </w:r>
+    </w:p>
+  </w:comment>
+</w:comments>
+</file>
+
+<file path=word/commentsExtended.xml><?xml version="1.0" encoding="utf-8"?>
+<w15:commentsEx xmlns:wpc="http://schemas.microsoft.com/office/word/2010/wordprocessingCanvas" xmlns:cx="http://schemas.microsoft.com/office/drawing/2014/chartex" xmlns:cx1="http://schemas.microsoft.com/office/drawing/2015/9/8/chartex" xmlns:cx2="http://schemas.microsoft.com/office/drawing/2015/10/21/chartex" xmlns:cx3="http://schemas.microsoft.com/office/drawing/2016/5/9/chartex" xmlns:cx4="http://schemas.microsoft.com/office/drawing/2016/5/10/chartex" xmlns:cx5="http://schemas.microsoft.com/office/drawing/2016/5/11/chartex" xmlns:cx6="http://schemas.microsoft.com/office/drawing/2016/5/12/chartex" xmlns:cx7="http://schemas.microsoft.com/office/drawing/2016/5/13/chartex" xmlns:cx8="http://schemas.microsoft.com/office/drawing/2016/5/14/chartex" xmlns:mc="http://schemas.openxmlformats.org/markup-compatibility/2006" xmlns:aink="http://schemas.microsoft.com/office/drawing/2016/ink" xmlns:am3d="http://schemas.microsoft.com/office/drawing/2017/model3d" xmlns:o="urn:schemas-microsoft-com:office:office" xmlns:oel="http://schemas.microsoft.com/office/2019/extlst" xmlns:r="http://schemas.openxmlformats.org/officeDocument/2006/relationships" xmlns:m="http://schemas.openxmlformats.org/officeDocument/2006/math" xmlns:v="urn:schemas-microsoft-com:vml" xmlns:wp14="http://schemas.microsoft.com/office/word/2010/wordprocessingDrawing" xmlns:wp="http://schemas.openxmlformats.org/drawingml/2006/wordprocessingDrawing" xmlns:w10="urn:schemas-microsoft-com:office:word" xmlns:w="http://schemas.openxmlformats.org/wordprocessingml/2006/main" xmlns:w14="http://schemas.microsoft.com/office/word/2010/wordml" xmlns:w15="http://schemas.microsoft.com/office/word/2012/wordml" xmlns:w16cex="http://schemas.microsoft.com/office/word/2018/wordml/cex" xmlns:w16cid="http://schemas.microsoft.com/office/word/2016/wordml/cid" xmlns:w16="http://schemas.microsoft.com/office/word/2018/wordml" xmlns:w16du="http://schemas.microsoft.com/office/word/2023/wordml/word16du" xmlns:w16sdtdh="http://schemas.microsoft.com/office/word/2020/wordml/sdtdatahash" xmlns:w16sdtfl="http://schemas.microsoft.com/office/word/2024/wordml/sdtformatlock" xmlns:w16se="http://schemas.microsoft.com/office/word/2015/wordml/symex" xmlns:wpg="http://schemas.microsoft.com/office/word/2010/wordprocessingGroup" xmlns:wpi="http://schemas.microsoft.com/office/word/2010/wordprocessingInk" xmlns:wne="http://schemas.microsoft.com/office/word/2006/wordml" xmlns:wps="http://schemas.microsoft.com/office/word/2010/wordprocessingShape" mc:Ignorable="w14 w15 w16se w16cid w16 w16cex w16sdtdh w16sdtfl w16du wp14">
+  <w15:commentEx w15:paraId="36894FE6" w15:done="0"/>
+</w15:commentsEx>
+</file>
+
+<file path=word/commentsExtensible.xml><?xml version="1.0" encoding="utf-8"?>
+<w16cex:commentsExtensible xmlns:wpc="http://schemas.microsoft.com/office/word/2010/wordprocessingCanvas" xmlns:cx="http://schemas.microsoft.com/office/drawing/2014/chartex" xmlns:cx1="http://schemas.microsoft.com/office/drawing/2015/9/8/chartex" xmlns:cx2="http://schemas.microsoft.com/office/drawing/2015/10/21/chartex" xmlns:cx3="http://schemas.microsoft.com/office/drawing/2016/5/9/chartex" xmlns:cx4="http://schemas.microsoft.com/office/drawing/2016/5/10/chartex" xmlns:cx5="http://schemas.microsoft.com/office/drawing/2016/5/11/chartex" xmlns:cx6="http://schemas.microsoft.com/office/drawing/2016/5/12/chartex" xmlns:cx7="http://schemas.microsoft.com/office/drawing/2016/5/13/chartex" xmlns:cx8="http://schemas.microsoft.com/office/drawing/2016/5/14/chartex" xmlns:cr="http://schemas.microsoft.com/office/comments/2020/reactions" xmlns:mc="http://schemas.openxmlformats.org/markup-compatibility/2006" xmlns:aink="http://schemas.microsoft.com/office/drawing/2016/ink" xmlns:am3d="http://schemas.microsoft.com/office/drawing/2017/model3d" xmlns:o="urn:schemas-microsoft-com:office:office" xmlns:oel="http://schemas.microsoft.com/office/2019/extlst" xmlns:r="http://schemas.openxmlformats.org/officeDocument/2006/relationships" xmlns:m="http://schemas.openxmlformats.org/officeDocument/2006/math" xmlns:v="urn:schemas-microsoft-com:vml" xmlns:wp14="http://schemas.microsoft.com/office/word/2010/wordprocessingDrawing" xmlns:wp="http://schemas.openxmlformats.org/drawingml/2006/wordprocessingDrawing" xmlns:w10="urn:schemas-microsoft-com:office:word" xmlns:w="http://schemas.openxmlformats.org/wordprocessingml/2006/main" xmlns:w14="http://schemas.microsoft.com/office/word/2010/wordml" xmlns:w15="http://schemas.microsoft.com/office/word/2012/wordml" xmlns:w16cex="http://schemas.microsoft.com/office/word/2018/wordml/cex" xmlns:w16cid="http://schemas.microsoft.com/office/word/2016/wordml/cid" xmlns:w16="http://schemas.microsoft.com/office/word/2018/wordml" xmlns:w16du="http://schemas.microsoft.com/office/word/2023/wordml/word16du" xmlns:w16sdtdh="http://schemas.microsoft.com/office/word/2020/wordml/sdtdatahash" xmlns:w16sdtfl="http://schemas.microsoft.com/office/word/2024/wordml/sdtformatlock" xmlns:w16se="http://schemas.microsoft.com/office/word/2015/wordml/symex" xmlns:wpg="http://schemas.microsoft.com/office/word/2010/wordprocessingGroup" xmlns:wpi="http://schemas.microsoft.com/office/word/2010/wordprocessingInk" xmlns:wne="http://schemas.microsoft.com/office/word/2006/wordml" xmlns:wps="http://schemas.microsoft.com/office/word/2010/wordprocessingShape" mc:Ignorable="w14 w15 w16se w16cid w16 w16cex w16sdtdh w16sdtfl cr w16du wp14">
+  <w16cex:commentExtensible w16cex:durableId="4B610D9D" w16cex:dateUtc="2026-10-01T00:33:00Z"/>
+</w16cex:commentsExtensible>
+</file>
+
+<file path=word/commentsIds.xml><?xml version="1.0" encoding="utf-8"?>
+<w16cid:commentsIds xmlns:wpc="http://schemas.microsoft.com/office/word/2010/wordprocessingCanvas" xmlns:cx="http://schemas.microsoft.com/office/drawing/2014/chartex" xmlns:cx1="http://schemas.microsoft.com/office/drawing/2015/9/8/chartex" xmlns:cx2="http://schemas.microsoft.com/office/drawing/2015/10/21/chartex" xmlns:cx3="http://schemas.microsoft.com/office/drawing/2016/5/9/chartex" xmlns:cx4="http://schemas.microsoft.com/office/drawing/2016/5/10/chartex" xmlns:cx5="http://schemas.microsoft.com/office/drawing/2016/5/11/chartex" xmlns:cx6="http://schemas.microsoft.com/office/drawing/2016/5/12/chartex" xmlns:cx7="http://schemas.microsoft.com/office/drawing/2016/5/13/chartex" xmlns:cx8="http://schemas.microsoft.com/office/drawing/2016/5/14/chartex" xmlns:mc="http://schemas.openxmlformats.org/markup-compatibility/2006" xmlns:aink="http://schemas.microsoft.com/office/drawing/2016/ink" xmlns:am3d="http://schemas.microsoft.com/office/drawing/2017/model3d" xmlns:o="urn:schemas-microsoft-com:office:office" xmlns:oel="http://schemas.microsoft.com/office/2019/extlst" xmlns:r="http://schemas.openxmlformats.org/officeDocument/2006/relationships" xmlns:m="http://schemas.openxmlformats.org/officeDocument/2006/math" xmlns:v="urn:schemas-microsoft-com:vml" xmlns:wp14="http://schemas.microsoft.com/office/word/2010/wordprocessingDrawing" xmlns:wp="http://schemas.openxmlformats.org/drawingml/2006/wordprocessingDrawing" xmlns:w10="urn:schemas-microsoft-com:office:word" xmlns:w="http://schemas.openxmlformats.org/wordprocessingml/2006/main" xmlns:w14="http://schemas.microsoft.com/office/word/2010/wordml" xmlns:w15="http://schemas.microsoft.com/office/word/2012/wordml" xmlns:w16cex="http://schemas.microsoft.com/office/word/2018/wordml/cex" xmlns:w16cid="http://schemas.microsoft.com/office/word/2016/wordml/cid" xmlns:w16="http://schemas.microsoft.com/office/word/2018/wordml" xmlns:w16du="http://schemas.microsoft.com/office/word/2023/wordml/word16du" xmlns:w16sdtdh="http://schemas.microsoft.com/office/word/2020/wordml/sdtdatahash" xmlns:w16sdtfl="http://schemas.microsoft.com/office/word/2024/wordml/sdtformatlock" xmlns:w16se="http://schemas.microsoft.com/office/word/2015/wordml/symex" xmlns:wpg="http://schemas.microsoft.com/office/word/2010/wordprocessingGroup" xmlns:wpi="http://schemas.microsoft.com/office/word/2010/wordprocessingInk" xmlns:wne="http://schemas.microsoft.com/office/word/2006/wordml" xmlns:wps="http://schemas.microsoft.com/office/word/2010/wordprocessingShape" mc:Ignorable="w14 w15 w16se w16cid w16 w16cex w16sdtdh w16sdtfl w16du wp14">
+  <w16cid:commentId w16cid:paraId="36894FE6" w16cid:durableId="4B610D9D"/>
+</w16cid:commentsIds>
 </file>
 
 <file path=word/endnotes.xml><?xml version="1.0" encoding="utf-8"?>
@@ -443,7 +1298,6 @@
           <w:docPartUnique/>
         </w:docPartObj>
       </w:sdtPr>
-      <w:sdtEndPr/>
       <w:sdtContent>
         <w:r>
           <w:fldChar w:fldCharType="begin"/>
@@ -519,7 +1373,7 @@
         <w:rFonts w:ascii="Courier New" w:hAnsi="Courier New" w:cs="Courier New" w:hint="default"/>
       </w:rPr>
     </w:lvl>
-    <w:lvl w:ilvl="2" w:tplc="04090005" w:tentative="1">
+    <w:lvl w:ilvl="2" w:tplc="04090005">
       <w:start w:val="1"/>
       <w:numFmt w:val="bullet"/>
       <w:lvlText w:val=""/>
@@ -531,7 +1385,7 @@
         <w:rFonts w:ascii="Wingdings" w:hAnsi="Wingdings" w:hint="default"/>
       </w:rPr>
     </w:lvl>
-    <w:lvl w:ilvl="3" w:tplc="04090001" w:tentative="1">
+    <w:lvl w:ilvl="3" w:tplc="04090001">
       <w:start w:val="1"/>
       <w:numFmt w:val="bullet"/>
       <w:lvlText w:val=""/>
@@ -608,6 +1462,14 @@
     <w:abstractNumId w:val="0"/>
   </w:num>
 </w:numbering>
+</file>
+
+<file path=word/people.xml><?xml version="1.0" encoding="utf-8"?>
+<w15:people xmlns:wpc="http://schemas.microsoft.com/office/word/2010/wordprocessingCanvas" xmlns:cx="http://schemas.microsoft.com/office/drawing/2014/chartex" xmlns:cx1="http://schemas.microsoft.com/office/drawing/2015/9/8/chartex" xmlns:cx2="http://schemas.microsoft.com/office/drawing/2015/10/21/chartex" xmlns:cx3="http://schemas.microsoft.com/office/drawing/2016/5/9/chartex" xmlns:cx4="http://schemas.microsoft.com/office/drawing/2016/5/10/chartex" xmlns:cx5="http://schemas.microsoft.com/office/drawing/2016/5/11/chartex" xmlns:cx6="http://schemas.microsoft.com/office/drawing/2016/5/12/chartex" xmlns:cx7="http://schemas.microsoft.com/office/drawing/2016/5/13/chartex" xmlns:cx8="http://schemas.microsoft.com/office/drawing/2016/5/14/chartex" xmlns:mc="http://schemas.openxmlformats.org/markup-compatibility/2006" xmlns:aink="http://schemas.microsoft.com/office/drawing/2016/ink" xmlns:am3d="http://schemas.microsoft.com/office/drawing/2017/model3d" xmlns:o="urn:schemas-microsoft-com:office:office" xmlns:oel="http://schemas.microsoft.com/office/2019/extlst" xmlns:r="http://schemas.openxmlformats.org/officeDocument/2006/relationships" xmlns:m="http://schemas.openxmlformats.org/officeDocument/2006/math" xmlns:v="urn:schemas-microsoft-com:vml" xmlns:wp14="http://schemas.microsoft.com/office/word/2010/wordprocessingDrawing" xmlns:wp="http://schemas.openxmlformats.org/drawingml/2006/wordprocessingDrawing" xmlns:w10="urn:schemas-microsoft-com:office:word" xmlns:w="http://schemas.openxmlformats.org/wordprocessingml/2006/main" xmlns:w14="http://schemas.microsoft.com/office/word/2010/wordml" xmlns:w15="http://schemas.microsoft.com/office/word/2012/wordml" xmlns:w16cex="http://schemas.microsoft.com/office/word/2018/wordml/cex" xmlns:w16cid="http://schemas.microsoft.com/office/word/2016/wordml/cid" xmlns:w16="http://schemas.microsoft.com/office/word/2018/wordml" xmlns:w16du="http://schemas.microsoft.com/office/word/2023/wordml/word16du" xmlns:w16sdtdh="http://schemas.microsoft.com/office/word/2020/wordml/sdtdatahash" xmlns:w16sdtfl="http://schemas.microsoft.com/office/word/2024/wordml/sdtformatlock" xmlns:w16se="http://schemas.microsoft.com/office/word/2015/wordml/symex" xmlns:wpg="http://schemas.microsoft.com/office/word/2010/wordprocessingGroup" xmlns:wpi="http://schemas.microsoft.com/office/word/2010/wordprocessingInk" xmlns:wne="http://schemas.microsoft.com/office/word/2006/wordml" xmlns:wps="http://schemas.microsoft.com/office/word/2010/wordprocessingShape" mc:Ignorable="w14 w15 w16se w16cid w16 w16cex w16sdtdh w16sdtfl w16du wp14">
+  <w15:person w15:author="Alessandro dos Santos">
+    <w15:presenceInfo w15:providerId="Windows Live" w15:userId="59db5754b41022c6"/>
+  </w15:person>
+</w15:people>
 </file>
 
 <file path=word/styles.xml><?xml version="1.0" encoding="utf-8"?>
@@ -1571,6 +2433,72 @@
     <w:uiPriority w:val="99"/>
     <w:rsid w:val="00F74A5E"/>
   </w:style>
+  <w:style w:type="character" w:styleId="Refdecomentrio">
+    <w:name w:val="annotation reference"/>
+    <w:basedOn w:val="Fontepargpadro"/>
+    <w:uiPriority w:val="99"/>
+    <w:semiHidden/>
+    <w:unhideWhenUsed/>
+    <w:rsid w:val="000D0FF1"/>
+    <w:rPr>
+      <w:sz w:val="16"/>
+      <w:szCs w:val="16"/>
+    </w:rPr>
+  </w:style>
+  <w:style w:type="paragraph" w:styleId="Textodecomentrio">
+    <w:name w:val="annotation text"/>
+    <w:basedOn w:val="Normal"/>
+    <w:link w:val="TextodecomentrioChar"/>
+    <w:uiPriority w:val="99"/>
+    <w:unhideWhenUsed/>
+    <w:rsid w:val="000D0FF1"/>
+    <w:pPr>
+      <w:spacing w:line="240" w:lineRule="auto"/>
+    </w:pPr>
+    <w:rPr>
+      <w:sz w:val="20"/>
+      <w:szCs w:val="20"/>
+    </w:rPr>
+  </w:style>
+  <w:style w:type="character" w:customStyle="1" w:styleId="TextodecomentrioChar">
+    <w:name w:val="Texto de comentário Char"/>
+    <w:basedOn w:val="Fontepargpadro"/>
+    <w:link w:val="Textodecomentrio"/>
+    <w:uiPriority w:val="99"/>
+    <w:rsid w:val="000D0FF1"/>
+    <w:rPr>
+      <w:sz w:val="20"/>
+      <w:szCs w:val="20"/>
+    </w:rPr>
+  </w:style>
+  <w:style w:type="paragraph" w:styleId="Assuntodocomentrio">
+    <w:name w:val="annotation subject"/>
+    <w:basedOn w:val="Textodecomentrio"/>
+    <w:next w:val="Textodecomentrio"/>
+    <w:link w:val="AssuntodocomentrioChar"/>
+    <w:uiPriority w:val="99"/>
+    <w:semiHidden/>
+    <w:unhideWhenUsed/>
+    <w:rsid w:val="000D0FF1"/>
+    <w:rPr>
+      <w:b/>
+      <w:bCs/>
+    </w:rPr>
+  </w:style>
+  <w:style w:type="character" w:customStyle="1" w:styleId="AssuntodocomentrioChar">
+    <w:name w:val="Assunto do comentário Char"/>
+    <w:basedOn w:val="TextodecomentrioChar"/>
+    <w:link w:val="Assuntodocomentrio"/>
+    <w:uiPriority w:val="99"/>
+    <w:semiHidden/>
+    <w:rsid w:val="000D0FF1"/>
+    <w:rPr>
+      <w:b/>
+      <w:bCs/>
+      <w:sz w:val="20"/>
+      <w:szCs w:val="20"/>
+    </w:rPr>
+  </w:style>
 </w:styles>
 </file>
 

</xml_diff>